<commit_message>
feat: add company stamp and auto sign feature
</commit_message>
<xml_diff>
--- a/apps/api/src/modules/applications/templates/arf-deed-of-assignment.docx
+++ b/apps/api/src/modules/applications/templates/arf-deed-of-assignment.docx
@@ -5046,12 +5046,9 @@
       <w:pPr>
         <w:jc w:val="both"/>
         <w:rPr>
-          <w:rFonts w:ascii="Arial" w:hAnsi="Arial" w:cs="Arial"/>
-          <w:b/>
-          <w:bCs/>
-          <w:sz w:val="20"/>
-          <w:szCs w:val="20"/>
-          <w:u w:val="single"/>
+          <w:rFonts w:ascii="Arial" w:hAnsi="Arial"/>
+          <w:sz w:val="20"/>
+          <w:szCs w:val="20"/>
         </w:rPr>
       </w:pPr>
     </w:p>
@@ -5060,14 +5057,14 @@
         <w:spacing w:after="0"/>
         <w:jc w:val="both"/>
         <w:rPr>
-          <w:rFonts w:ascii="Arial" w:hAnsi="Arial" w:cs="Arial"/>
-          <w:sz w:val="20"/>
-          <w:szCs w:val="20"/>
-        </w:rPr>
-      </w:pPr>
-      <w:r>
-        <w:rPr>
-          <w:rFonts w:ascii="Arial" w:hAnsi="Arial" w:cs="Arial"/>
+          <w:rFonts w:ascii="Arial" w:hAnsi="Arial"/>
+          <w:sz w:val="20"/>
+          <w:szCs w:val="20"/>
+        </w:rPr>
+      </w:pPr>
+      <w:r>
+        <w:rPr>
+          <w:rFonts w:ascii="Arial" w:hAnsi="Arial"/>
           <w:sz w:val="20"/>
           <w:szCs w:val="20"/>
         </w:rPr>
@@ -5075,7 +5072,7 @@
       </w:r>
       <w:r>
         <w:rPr>
-          <w:rFonts w:ascii="Arial" w:hAnsi="Arial" w:cs="Arial"/>
+          <w:rFonts w:ascii="Arial" w:hAnsi="Arial"/>
           <w:sz w:val="20"/>
           <w:szCs w:val="20"/>
         </w:rPr>
@@ -5083,7 +5080,7 @@
       </w:r>
       <w:r>
         <w:rPr>
-          <w:rFonts w:ascii="Arial" w:hAnsi="Arial" w:cs="Arial"/>
+          <w:rFonts w:ascii="Arial" w:hAnsi="Arial"/>
           <w:sz w:val="20"/>
           <w:szCs w:val="20"/>
         </w:rPr>
@@ -5091,7 +5088,7 @@
       </w:r>
       <w:r>
         <w:rPr>
-          <w:rFonts w:ascii="Arial" w:hAnsi="Arial" w:cs="Arial"/>
+          <w:rFonts w:ascii="Arial" w:hAnsi="Arial"/>
           <w:sz w:val="20"/>
           <w:szCs w:val="20"/>
         </w:rPr>
@@ -5099,11 +5096,18 @@
       </w:r>
       <w:r>
         <w:rPr>
-          <w:rFonts w:ascii="Arial" w:hAnsi="Arial" w:cs="Arial"/>
+          <w:rFonts w:ascii="Arial" w:hAnsi="Arial"/>
           <w:sz w:val="20"/>
           <w:szCs w:val="20"/>
         </w:rPr>
         <w:tab/>
+      </w:r>
+      <w:r>
+        <w:rPr>
+          <w:rFonts w:ascii="Arial" w:hAnsi="Arial"/>
+          <w:sz w:val="20"/>
+          <w:szCs w:val="20"/>
+        </w:rPr>
         <w:t>)</w:t>
       </w:r>
     </w:p>
@@ -5112,14 +5116,14 @@
         <w:spacing w:after="0"/>
         <w:jc w:val="both"/>
         <w:rPr>
-          <w:rFonts w:ascii="Arial" w:hAnsi="Arial" w:cs="Arial"/>
-          <w:sz w:val="20"/>
-          <w:szCs w:val="20"/>
-        </w:rPr>
-      </w:pPr>
-      <w:r>
-        <w:rPr>
-          <w:rFonts w:ascii="Arial" w:hAnsi="Arial" w:cs="Arial"/>
+          <w:rFonts w:ascii="Arial" w:hAnsi="Arial"/>
+          <w:sz w:val="20"/>
+          <w:szCs w:val="20"/>
+        </w:rPr>
+      </w:pPr>
+      <w:r>
+        <w:rPr>
+          <w:rFonts w:ascii="Arial" w:hAnsi="Arial"/>
           <w:sz w:val="20"/>
           <w:szCs w:val="20"/>
         </w:rPr>
@@ -5127,7 +5131,7 @@
       </w:r>
       <w:r>
         <w:rPr>
-          <w:rFonts w:ascii="Arial" w:hAnsi="Arial" w:cs="Arial"/>
+          <w:rFonts w:ascii="Arial" w:hAnsi="Arial"/>
           <w:sz w:val="20"/>
           <w:szCs w:val="20"/>
         </w:rPr>
@@ -5135,7 +5139,7 @@
       </w:r>
       <w:r>
         <w:rPr>
-          <w:rFonts w:ascii="Arial" w:hAnsi="Arial" w:cs="Arial"/>
+          <w:rFonts w:ascii="Arial" w:hAnsi="Arial"/>
           <w:sz w:val="20"/>
           <w:szCs w:val="20"/>
         </w:rPr>
@@ -5143,11 +5147,18 @@
       </w:r>
       <w:r>
         <w:rPr>
-          <w:rFonts w:ascii="Arial" w:hAnsi="Arial" w:cs="Arial"/>
+          <w:rFonts w:ascii="Arial" w:hAnsi="Arial"/>
           <w:sz w:val="20"/>
           <w:szCs w:val="20"/>
         </w:rPr>
         <w:tab/>
+      </w:r>
+      <w:r>
+        <w:rPr>
+          <w:rFonts w:ascii="Arial" w:hAnsi="Arial"/>
+          <w:sz w:val="20"/>
+          <w:szCs w:val="20"/>
+        </w:rPr>
         <w:t>)</w:t>
       </w:r>
     </w:p>
@@ -5156,16 +5167,14 @@
         <w:spacing w:after="0"/>
         <w:jc w:val="both"/>
         <w:rPr>
-          <w:rFonts w:ascii="Arial" w:hAnsi="Arial" w:cs="Arial"/>
-          <w:sz w:val="20"/>
-          <w:szCs w:val="20"/>
-        </w:rPr>
-      </w:pPr>
-      <w:r>
-        <w:rPr>
-          <w:rFonts w:ascii="Arial" w:hAnsi="Arial" w:cs="Arial"/>
-          <w:b/>
-          <w:bCs/>
+          <w:rFonts w:ascii="Arial" w:hAnsi="Arial"/>
+          <w:sz w:val="20"/>
+          <w:szCs w:val="20"/>
+        </w:rPr>
+      </w:pPr>
+      <w:r>
+        <w:rPr>
+          <w:rFonts w:ascii="Arial" w:hAnsi="Arial"/>
           <w:sz w:val="20"/>
           <w:szCs w:val="20"/>
         </w:rPr>
@@ -5173,20 +5182,23 @@
       </w:r>
       <w:r>
         <w:rPr>
-          <w:rFonts w:ascii="Arial" w:hAnsi="Arial" w:cs="Arial"/>
-          <w:b/>
-          <w:bCs/>
+          <w:rFonts w:ascii="Arial" w:hAnsi="Arial"/>
           <w:sz w:val="20"/>
           <w:szCs w:val="20"/>
         </w:rPr>
         <w:tab/>
+      </w:r>
+      <w:r>
+        <w:rPr>
+          <w:rFonts w:ascii="Arial" w:hAnsi="Arial"/>
+          <w:sz w:val="20"/>
+          <w:szCs w:val="20"/>
+        </w:rPr>
         <w:t>)</w:t>
       </w:r>
       <w:r>
         <w:rPr>
-          <w:rFonts w:ascii="Arial" w:hAnsi="Arial" w:cs="Arial"/>
-          <w:b/>
-          <w:bCs/>
+          <w:rFonts w:ascii="Arial" w:hAnsi="Arial"/>
           <w:sz w:val="20"/>
           <w:szCs w:val="20"/>
         </w:rPr>
@@ -5194,7 +5206,7 @@
       </w:r>
       <w:r>
         <w:rPr>
-          <w:rFonts w:ascii="Arial" w:hAnsi="Arial" w:cs="Arial"/>
+          <w:rFonts w:ascii="Arial" w:hAnsi="Arial"/>
           <w:sz w:val="20"/>
           <w:szCs w:val="20"/>
         </w:rPr>
@@ -5206,14 +5218,14 @@
         <w:spacing w:after="0"/>
         <w:jc w:val="both"/>
         <w:rPr>
-          <w:rFonts w:ascii="Arial" w:hAnsi="Arial" w:cs="Arial"/>
-          <w:sz w:val="20"/>
-          <w:szCs w:val="20"/>
-        </w:rPr>
-      </w:pPr>
-      <w:r>
-        <w:rPr>
-          <w:rFonts w:ascii="Arial" w:hAnsi="Arial" w:cs="Arial"/>
+          <w:rFonts w:ascii="Arial" w:hAnsi="Arial"/>
+          <w:sz w:val="20"/>
+          <w:szCs w:val="20"/>
+        </w:rPr>
+      </w:pPr>
+      <w:r>
+        <w:rPr>
+          <w:rFonts w:ascii="Arial" w:hAnsi="Arial"/>
           <w:sz w:val="20"/>
           <w:szCs w:val="20"/>
         </w:rPr>
@@ -5221,7 +5233,7 @@
       </w:r>
       <w:r>
         <w:rPr>
-          <w:rFonts w:ascii="Arial" w:hAnsi="Arial" w:cs="Arial"/>
+          <w:rFonts w:ascii="Arial" w:hAnsi="Arial"/>
           <w:sz w:val="20"/>
           <w:szCs w:val="20"/>
         </w:rPr>
@@ -5229,7 +5241,7 @@
       </w:r>
       <w:r>
         <w:rPr>
-          <w:rFonts w:ascii="Arial" w:hAnsi="Arial" w:cs="Arial"/>
+          <w:rFonts w:ascii="Arial" w:hAnsi="Arial"/>
           <w:sz w:val="20"/>
           <w:szCs w:val="20"/>
         </w:rPr>
@@ -5237,7 +5249,7 @@
       </w:r>
       <w:r>
         <w:rPr>
-          <w:rFonts w:ascii="Arial" w:hAnsi="Arial" w:cs="Arial"/>
+          <w:rFonts w:ascii="Arial" w:hAnsi="Arial"/>
           <w:sz w:val="20"/>
           <w:szCs w:val="20"/>
         </w:rPr>
@@ -5245,7 +5257,7 @@
       </w:r>
       <w:r>
         <w:rPr>
-          <w:rFonts w:ascii="Arial" w:hAnsi="Arial" w:cs="Arial"/>
+          <w:rFonts w:ascii="Arial" w:hAnsi="Arial"/>
           <w:sz w:val="20"/>
           <w:szCs w:val="20"/>
         </w:rPr>
@@ -5253,12 +5265,28 @@
       </w:r>
       <w:r>
         <w:rPr>
-          <w:rFonts w:ascii="Arial" w:hAnsi="Arial" w:cs="Arial"/>
+          <w:rFonts w:ascii="Arial" w:hAnsi="Arial"/>
           <w:sz w:val="20"/>
           <w:szCs w:val="20"/>
         </w:rPr>
         <w:tab/>
-        <w:t>Name:</w:t>
+      </w:r>
+      <w:r>
+        <w:rPr>
+          <w:rFonts w:ascii="Arial" w:hAnsi="Arial"/>
+          <w:sz w:val="20"/>
+          <w:szCs w:val="20"/>
+        </w:rPr>
+        <w:t xml:space="preserve">Name: </w:t>
+      </w:r>
+      <w:r>
+        <w:rPr>
+          <w:rFonts w:ascii="Arial" w:hAnsi="Arial"/>
+          <w:sz w:val="20"/>
+          <w:szCs w:val="20"/>
+          <w:highlight w:val="yellow"/>
+        </w:rPr>
+        <w:t>{ssp_1_name}</w:t>
       </w:r>
     </w:p>
     <w:p>
@@ -5266,14 +5294,14 @@
         <w:spacing w:after="0"/>
         <w:jc w:val="both"/>
         <w:rPr>
-          <w:rFonts w:ascii="Arial" w:hAnsi="Arial" w:cs="Arial"/>
-          <w:sz w:val="20"/>
-          <w:szCs w:val="20"/>
-        </w:rPr>
-      </w:pPr>
-      <w:r>
-        <w:rPr>
-          <w:rFonts w:ascii="Arial" w:hAnsi="Arial" w:cs="Arial"/>
+          <w:rFonts w:ascii="Arial" w:hAnsi="Arial"/>
+          <w:sz w:val="20"/>
+          <w:szCs w:val="20"/>
+        </w:rPr>
+      </w:pPr>
+      <w:r>
+        <w:rPr>
+          <w:rFonts w:ascii="Arial" w:hAnsi="Arial"/>
           <w:sz w:val="20"/>
           <w:szCs w:val="20"/>
         </w:rPr>
@@ -5281,7 +5309,7 @@
       </w:r>
       <w:r>
         <w:rPr>
-          <w:rFonts w:ascii="Arial" w:hAnsi="Arial" w:cs="Arial"/>
+          <w:rFonts w:ascii="Arial" w:hAnsi="Arial"/>
           <w:sz w:val="20"/>
           <w:szCs w:val="20"/>
         </w:rPr>
@@ -5289,7 +5317,7 @@
       </w:r>
       <w:r>
         <w:rPr>
-          <w:rFonts w:ascii="Arial" w:hAnsi="Arial" w:cs="Arial"/>
+          <w:rFonts w:ascii="Arial" w:hAnsi="Arial"/>
           <w:sz w:val="20"/>
           <w:szCs w:val="20"/>
         </w:rPr>
@@ -5297,7 +5325,7 @@
       </w:r>
       <w:r>
         <w:rPr>
-          <w:rFonts w:ascii="Arial" w:hAnsi="Arial" w:cs="Arial"/>
+          <w:rFonts w:ascii="Arial" w:hAnsi="Arial"/>
           <w:sz w:val="20"/>
           <w:szCs w:val="20"/>
         </w:rPr>
@@ -5305,7 +5333,7 @@
       </w:r>
       <w:r>
         <w:rPr>
-          <w:rFonts w:ascii="Arial" w:hAnsi="Arial" w:cs="Arial"/>
+          <w:rFonts w:ascii="Arial" w:hAnsi="Arial"/>
           <w:sz w:val="20"/>
           <w:szCs w:val="20"/>
         </w:rPr>
@@ -5313,59 +5341,75 @@
       </w:r>
       <w:r>
         <w:rPr>
-          <w:rFonts w:ascii="Arial" w:hAnsi="Arial" w:cs="Arial"/>
+          <w:rFonts w:ascii="Arial" w:hAnsi="Arial"/>
           <w:sz w:val="20"/>
           <w:szCs w:val="20"/>
         </w:rPr>
         <w:tab/>
-        <w:t>Designation:</w:t>
-      </w:r>
-    </w:p>
-    <w:p>
-      <w:pPr>
-        <w:jc w:val="both"/>
-        <w:rPr>
-          <w:rFonts w:ascii="Arial" w:hAnsi="Arial" w:cs="Arial"/>
-          <w:sz w:val="20"/>
-          <w:szCs w:val="20"/>
-        </w:rPr>
-      </w:pPr>
-    </w:p>
-    <w:p>
-      <w:pPr>
-        <w:jc w:val="both"/>
-        <w:rPr>
-          <w:rFonts w:ascii="Arial" w:hAnsi="Arial" w:cs="Arial"/>
-          <w:sz w:val="20"/>
-          <w:szCs w:val="20"/>
-        </w:rPr>
-      </w:pPr>
-    </w:p>
-    <w:p>
-      <w:pPr>
-        <w:jc w:val="both"/>
-        <w:rPr>
-          <w:rFonts w:ascii="Arial" w:hAnsi="Arial" w:cs="Arial"/>
-          <w:sz w:val="20"/>
-          <w:szCs w:val="20"/>
-        </w:rPr>
-      </w:pPr>
-    </w:p>
-    <w:p>
-      <w:pPr>
-        <w:jc w:val="both"/>
-        <w:rPr>
-          <w:rFonts w:ascii="Arial" w:hAnsi="Arial" w:cs="Arial"/>
-          <w:sz w:val="20"/>
-          <w:szCs w:val="20"/>
-        </w:rPr>
-      </w:pPr>
-    </w:p>
-    <w:p>
-      <w:pPr>
-        <w:jc w:val="both"/>
-        <w:rPr>
-          <w:rFonts w:ascii="Arial" w:hAnsi="Arial" w:cs="Arial"/>
+      </w:r>
+      <w:r>
+        <w:rPr>
+          <w:rFonts w:ascii="Arial" w:hAnsi="Arial"/>
+          <w:sz w:val="20"/>
+          <w:szCs w:val="20"/>
+        </w:rPr>
+        <w:t xml:space="preserve">Designation: </w:t>
+      </w:r>
+      <w:r>
+        <w:rPr>
+          <w:rFonts w:ascii="Arial" w:hAnsi="Arial"/>
+          <w:sz w:val="20"/>
+          <w:szCs w:val="20"/>
+          <w:highlight w:val="yellow"/>
+        </w:rPr>
+        <w:t>{ssp_1_designation}</w:t>
+      </w:r>
+    </w:p>
+    <w:p>
+      <w:pPr>
+        <w:jc w:val="both"/>
+        <w:rPr>
+          <w:rFonts w:ascii="Arial" w:hAnsi="Arial"/>
+          <w:sz w:val="20"/>
+          <w:szCs w:val="20"/>
+        </w:rPr>
+      </w:pPr>
+    </w:p>
+    <w:p>
+      <w:pPr>
+        <w:jc w:val="both"/>
+        <w:rPr>
+          <w:rFonts w:ascii="Arial" w:hAnsi="Arial"/>
+          <w:sz w:val="20"/>
+          <w:szCs w:val="20"/>
+        </w:rPr>
+      </w:pPr>
+    </w:p>
+    <w:p>
+      <w:pPr>
+        <w:jc w:val="both"/>
+        <w:rPr>
+          <w:rFonts w:ascii="Arial" w:hAnsi="Arial"/>
+          <w:sz w:val="20"/>
+          <w:szCs w:val="20"/>
+        </w:rPr>
+      </w:pPr>
+    </w:p>
+    <w:p>
+      <w:pPr>
+        <w:jc w:val="both"/>
+        <w:rPr>
+          <w:rFonts w:ascii="Arial" w:hAnsi="Arial"/>
+          <w:sz w:val="20"/>
+          <w:szCs w:val="20"/>
+        </w:rPr>
+      </w:pPr>
+    </w:p>
+    <w:p>
+      <w:pPr>
+        <w:jc w:val="both"/>
+        <w:rPr>
+          <w:rFonts w:ascii="Arial" w:hAnsi="Arial"/>
           <w:sz w:val="20"/>
           <w:szCs w:val="20"/>
         </w:rPr>
@@ -5376,14 +5420,14 @@
         <w:spacing w:after="0"/>
         <w:jc w:val="both"/>
         <w:rPr>
-          <w:rFonts w:ascii="Arial" w:hAnsi="Arial" w:cs="Arial"/>
-          <w:sz w:val="20"/>
-          <w:szCs w:val="20"/>
-        </w:rPr>
-      </w:pPr>
-      <w:r>
-        <w:rPr>
-          <w:rFonts w:ascii="Arial" w:hAnsi="Arial" w:cs="Arial"/>
+          <w:rFonts w:ascii="Arial" w:hAnsi="Arial"/>
+          <w:sz w:val="20"/>
+          <w:szCs w:val="20"/>
+        </w:rPr>
+      </w:pPr>
+      <w:r>
+        <w:rPr>
+          <w:rFonts w:ascii="Arial" w:hAnsi="Arial"/>
           <w:sz w:val="20"/>
           <w:szCs w:val="20"/>
         </w:rPr>
@@ -5391,7 +5435,7 @@
       </w:r>
       <w:r>
         <w:rPr>
-          <w:rFonts w:ascii="Arial" w:hAnsi="Arial" w:cs="Arial"/>
+          <w:rFonts w:ascii="Arial" w:hAnsi="Arial"/>
           <w:sz w:val="20"/>
           <w:szCs w:val="20"/>
         </w:rPr>
@@ -5399,7 +5443,7 @@
       </w:r>
       <w:r>
         <w:rPr>
-          <w:rFonts w:ascii="Arial" w:hAnsi="Arial" w:cs="Arial"/>
+          <w:rFonts w:ascii="Arial" w:hAnsi="Arial"/>
           <w:sz w:val="20"/>
           <w:szCs w:val="20"/>
         </w:rPr>
@@ -5407,7 +5451,7 @@
       </w:r>
       <w:r>
         <w:rPr>
-          <w:rFonts w:ascii="Arial" w:hAnsi="Arial" w:cs="Arial"/>
+          <w:rFonts w:ascii="Arial" w:hAnsi="Arial"/>
           <w:sz w:val="20"/>
           <w:szCs w:val="20"/>
         </w:rPr>
@@ -5415,7 +5459,7 @@
       </w:r>
       <w:r>
         <w:rPr>
-          <w:rFonts w:ascii="Arial" w:hAnsi="Arial" w:cs="Arial"/>
+          <w:rFonts w:ascii="Arial" w:hAnsi="Arial"/>
           <w:sz w:val="20"/>
           <w:szCs w:val="20"/>
         </w:rPr>
@@ -5423,7 +5467,7 @@
       </w:r>
       <w:r>
         <w:rPr>
-          <w:rFonts w:ascii="Arial" w:hAnsi="Arial" w:cs="Arial"/>
+          <w:rFonts w:ascii="Arial" w:hAnsi="Arial"/>
           <w:sz w:val="20"/>
           <w:szCs w:val="20"/>
         </w:rPr>
@@ -5431,7 +5475,7 @@
       </w:r>
       <w:r>
         <w:rPr>
-          <w:rFonts w:ascii="Arial" w:hAnsi="Arial" w:cs="Arial"/>
+          <w:rFonts w:ascii="Arial" w:hAnsi="Arial"/>
           <w:sz w:val="20"/>
           <w:szCs w:val="20"/>
         </w:rPr>
@@ -5443,14 +5487,14 @@
         <w:spacing w:after="0"/>
         <w:jc w:val="both"/>
         <w:rPr>
-          <w:rFonts w:ascii="Arial" w:hAnsi="Arial" w:cs="Arial"/>
-          <w:sz w:val="20"/>
-          <w:szCs w:val="20"/>
-        </w:rPr>
-      </w:pPr>
-      <w:r>
-        <w:rPr>
-          <w:rFonts w:ascii="Arial" w:hAnsi="Arial" w:cs="Arial"/>
+          <w:rFonts w:ascii="Arial" w:hAnsi="Arial"/>
+          <w:sz w:val="20"/>
+          <w:szCs w:val="20"/>
+        </w:rPr>
+      </w:pPr>
+      <w:r>
+        <w:rPr>
+          <w:rFonts w:ascii="Arial" w:hAnsi="Arial"/>
           <w:sz w:val="20"/>
           <w:szCs w:val="20"/>
         </w:rPr>
@@ -5458,7 +5502,7 @@
       </w:r>
       <w:r>
         <w:rPr>
-          <w:rFonts w:ascii="Arial" w:hAnsi="Arial" w:cs="Arial"/>
+          <w:rFonts w:ascii="Arial" w:hAnsi="Arial"/>
           <w:sz w:val="20"/>
           <w:szCs w:val="20"/>
         </w:rPr>
@@ -5466,7 +5510,7 @@
       </w:r>
       <w:r>
         <w:rPr>
-          <w:rFonts w:ascii="Arial" w:hAnsi="Arial" w:cs="Arial"/>
+          <w:rFonts w:ascii="Arial" w:hAnsi="Arial"/>
           <w:sz w:val="20"/>
           <w:szCs w:val="20"/>
         </w:rPr>
@@ -5474,7 +5518,7 @@
       </w:r>
       <w:r>
         <w:rPr>
-          <w:rFonts w:ascii="Arial" w:hAnsi="Arial" w:cs="Arial"/>
+          <w:rFonts w:ascii="Arial" w:hAnsi="Arial"/>
           <w:sz w:val="20"/>
           <w:szCs w:val="20"/>
         </w:rPr>
@@ -5482,7 +5526,7 @@
       </w:r>
       <w:r>
         <w:rPr>
-          <w:rFonts w:ascii="Arial" w:hAnsi="Arial" w:cs="Arial"/>
+          <w:rFonts w:ascii="Arial" w:hAnsi="Arial"/>
           <w:sz w:val="20"/>
           <w:szCs w:val="20"/>
         </w:rPr>
@@ -5490,12 +5534,28 @@
       </w:r>
       <w:r>
         <w:rPr>
-          <w:rFonts w:ascii="Arial" w:hAnsi="Arial" w:cs="Arial"/>
+          <w:rFonts w:ascii="Arial" w:hAnsi="Arial"/>
           <w:sz w:val="20"/>
           <w:szCs w:val="20"/>
         </w:rPr>
         <w:tab/>
-        <w:t>Name:</w:t>
+      </w:r>
+      <w:r>
+        <w:rPr>
+          <w:rFonts w:ascii="Arial" w:hAnsi="Arial"/>
+          <w:sz w:val="20"/>
+          <w:szCs w:val="20"/>
+        </w:rPr>
+        <w:t xml:space="preserve">Name: </w:t>
+      </w:r>
+      <w:r>
+        <w:rPr>
+          <w:rFonts w:ascii="Arial" w:hAnsi="Arial"/>
+          <w:sz w:val="20"/>
+          <w:szCs w:val="20"/>
+          <w:highlight w:val="yellow"/>
+        </w:rPr>
+        <w:t>{ssp_2_name}</w:t>
       </w:r>
     </w:p>
     <w:p>
@@ -5503,14 +5563,14 @@
         <w:spacing w:after="0"/>
         <w:jc w:val="both"/>
         <w:rPr>
-          <w:rFonts w:ascii="Arial" w:hAnsi="Arial" w:cs="Arial"/>
-          <w:sz w:val="20"/>
-          <w:szCs w:val="20"/>
-        </w:rPr>
-      </w:pPr>
-      <w:r>
-        <w:rPr>
-          <w:rFonts w:ascii="Arial" w:hAnsi="Arial" w:cs="Arial"/>
+          <w:rFonts w:ascii="Arial" w:hAnsi="Arial"/>
+          <w:sz w:val="20"/>
+          <w:szCs w:val="20"/>
+        </w:rPr>
+      </w:pPr>
+      <w:r>
+        <w:rPr>
+          <w:rFonts w:ascii="Arial" w:hAnsi="Arial"/>
           <w:sz w:val="20"/>
           <w:szCs w:val="20"/>
         </w:rPr>
@@ -5518,7 +5578,7 @@
       </w:r>
       <w:r>
         <w:rPr>
-          <w:rFonts w:ascii="Arial" w:hAnsi="Arial" w:cs="Arial"/>
+          <w:rFonts w:ascii="Arial" w:hAnsi="Arial"/>
           <w:sz w:val="20"/>
           <w:szCs w:val="20"/>
         </w:rPr>
@@ -5526,7 +5586,7 @@
       </w:r>
       <w:r>
         <w:rPr>
-          <w:rFonts w:ascii="Arial" w:hAnsi="Arial" w:cs="Arial"/>
+          <w:rFonts w:ascii="Arial" w:hAnsi="Arial"/>
           <w:sz w:val="20"/>
           <w:szCs w:val="20"/>
         </w:rPr>
@@ -5534,7 +5594,7 @@
       </w:r>
       <w:r>
         <w:rPr>
-          <w:rFonts w:ascii="Arial" w:hAnsi="Arial" w:cs="Arial"/>
+          <w:rFonts w:ascii="Arial" w:hAnsi="Arial"/>
           <w:sz w:val="20"/>
           <w:szCs w:val="20"/>
         </w:rPr>
@@ -5542,7 +5602,7 @@
       </w:r>
       <w:r>
         <w:rPr>
-          <w:rFonts w:ascii="Arial" w:hAnsi="Arial" w:cs="Arial"/>
+          <w:rFonts w:ascii="Arial" w:hAnsi="Arial"/>
           <w:sz w:val="20"/>
           <w:szCs w:val="20"/>
         </w:rPr>
@@ -5550,105 +5610,83 @@
       </w:r>
       <w:r>
         <w:rPr>
-          <w:rFonts w:ascii="Arial" w:hAnsi="Arial" w:cs="Arial"/>
+          <w:rFonts w:ascii="Arial" w:hAnsi="Arial"/>
           <w:sz w:val="20"/>
           <w:szCs w:val="20"/>
         </w:rPr>
         <w:tab/>
-        <w:t>Designation:</w:t>
-      </w:r>
-    </w:p>
-    <w:p>
-      <w:pPr>
-        <w:jc w:val="both"/>
-        <w:rPr>
-          <w:rFonts w:ascii="Arial" w:hAnsi="Arial" w:cs="Arial"/>
-          <w:sz w:val="20"/>
-          <w:szCs w:val="20"/>
-        </w:rPr>
-      </w:pPr>
-    </w:p>
-    <w:tbl>
-      <w:tblPr>
-        <w:tblStyle w:val="TableGrid"/>
-        <w:tblW w:w="0" w:type="auto"/>
-        <w:tblInd w:w="4135" w:type="dxa"/>
-        <w:tblLook w:val="04A0" w:firstRow="1" w:lastRow="0" w:firstColumn="1" w:lastColumn="0" w:noHBand="0" w:noVBand="1"/>
-      </w:tblPr>
-      <w:tblGrid>
-        <w:gridCol w:w="5215"/>
-      </w:tblGrid>
-      <w:tr>
-        <w:trPr>
-          <w:trHeight w:val="1592"/>
-        </w:trPr>
-        <w:tc>
-          <w:tcPr>
-            <w:tcW w:w="5215" w:type="dxa"/>
-          </w:tcPr>
-          <w:p>
-            <w:pPr>
-              <w:jc w:val="both"/>
-              <w:rPr>
-                <w:rFonts w:ascii="Arial" w:hAnsi="Arial" w:cs="Arial"/>
-                <w:sz w:val="20"/>
-                <w:szCs w:val="20"/>
-              </w:rPr>
-            </w:pPr>
-            <w:r>
-              <w:rPr>
-                <w:rFonts w:ascii="Arial" w:hAnsi="Arial" w:cs="Arial"/>
-                <w:sz w:val="20"/>
-                <w:szCs w:val="20"/>
-              </w:rPr>
-              <w:t xml:space="preserve">[SSP] </w:t>
-            </w:r>
-          </w:p>
-          <w:p>
-            <w:pPr>
-              <w:jc w:val="both"/>
-              <w:rPr>
-                <w:rFonts w:ascii="Arial" w:hAnsi="Arial" w:cs="Arial"/>
-                <w:sz w:val="20"/>
-                <w:szCs w:val="20"/>
-              </w:rPr>
-            </w:pPr>
-            <w:r>
-              <w:rPr>
-                <w:rFonts w:ascii="Arial" w:hAnsi="Arial" w:cs="Arial"/>
-                <w:sz w:val="20"/>
-                <w:szCs w:val="20"/>
-              </w:rPr>
-              <w:t>Company Stamp:</w:t>
-            </w:r>
-          </w:p>
-        </w:tc>
-      </w:tr>
-    </w:tbl>
-    <w:p>
-      <w:pPr>
-        <w:jc w:val="both"/>
-        <w:rPr>
-          <w:rFonts w:ascii="Arial" w:hAnsi="Arial" w:cs="Arial"/>
-          <w:sz w:val="20"/>
-          <w:szCs w:val="20"/>
-        </w:rPr>
-      </w:pPr>
-    </w:p>
-    <w:p>
-      <w:pPr>
-        <w:rPr>
-          <w:rFonts w:ascii="Arial" w:hAnsi="Arial" w:cs="Arial"/>
-          <w:sz w:val="20"/>
-          <w:szCs w:val="20"/>
-        </w:rPr>
-      </w:pPr>
-      <w:r>
-        <w:rPr>
-          <w:rFonts w:ascii="Arial" w:hAnsi="Arial" w:cs="Arial"/>
-          <w:sz w:val="20"/>
-          <w:szCs w:val="20"/>
-        </w:rPr>
+      </w:r>
+      <w:r>
+        <w:rPr>
+          <w:rFonts w:ascii="Arial" w:hAnsi="Arial"/>
+          <w:sz w:val="20"/>
+          <w:szCs w:val="20"/>
+        </w:rPr>
+        <w:t xml:space="preserve">Designation: </w:t>
+      </w:r>
+      <w:r>
+        <w:rPr>
+          <w:rFonts w:ascii="Arial" w:hAnsi="Arial"/>
+          <w:sz w:val="20"/>
+          <w:szCs w:val="20"/>
+          <w:highlight w:val="yellow"/>
+        </w:rPr>
+        <w:t>{ssp_2_designation}</w:t>
+      </w:r>
+    </w:p>
+    <w:p>
+      <w:pPr>
+        <w:jc w:val="both"/>
+        <w:rPr>
+          <w:rFonts w:ascii="Arial" w:hAnsi="Arial"/>
+          <w:sz w:val="20"/>
+          <w:szCs w:val="20"/>
+        </w:rPr>
+      </w:pPr>
+    </w:p>
+    <w:p>
+      <w:pPr>
+        <w:spacing w:line="360" w:lineRule="auto"/>
+        <w:jc w:val="both"/>
+        <w:rPr>
+          <w:rFonts w:ascii="Arial" w:hAnsi="Arial"/>
+          <w:sz w:val="20"/>
+          <w:szCs w:val="20"/>
+        </w:rPr>
+      </w:pPr>
+      <w:r>
+        <w:rPr>
+          <w:rFonts w:ascii="Arial" w:hAnsi="Arial"/>
+          <w:sz w:val="20"/>
+          <w:szCs w:val="20"/>
+        </w:rPr>
+        <w:t>[SSP]</w:t>
+      </w:r>
+    </w:p>
+    <w:p>
+      <w:pPr>
+        <w:spacing w:line="360" w:lineRule="auto"/>
+        <w:jc w:val="both"/>
+        <w:rPr>
+          <w:rFonts w:ascii="Arial" w:hAnsi="Arial"/>
+          <w:sz w:val="20"/>
+          <w:szCs w:val="20"/>
+        </w:rPr>
+      </w:pPr>
+      <w:r>
+        <w:rPr>
+          <w:rFonts w:ascii="Arial" w:hAnsi="Arial"/>
+          <w:sz w:val="20"/>
+          <w:szCs w:val="20"/>
+        </w:rPr>
+        <w:t>Company Stamp: §SSP_COMPANY_STAMP_IMAGE§</w:t>
+      </w:r>
+    </w:p>
+    <w:p>
+      <w:pPr>
+        <w:spacing w:line="360" w:lineRule="auto"/>
+      </w:pPr>
+      <w:r>
         <w:br w:type="page"/>
       </w:r>
     </w:p>
@@ -6018,7 +6056,7 @@
                 <w:sz w:val="20"/>
                 <w:szCs w:val="20"/>
               </w:rPr>
-              <w:t>...........................................................................</w:t>
+              <w:t>______________________________________</w:t>
             </w:r>
           </w:p>
         </w:tc>
@@ -6048,7 +6086,7 @@
                 <w:sz w:val="20"/>
                 <w:szCs w:val="20"/>
               </w:rPr>
-              <w:t>..............................................................</w:t>
+              <w:t>_______________________________</w:t>
             </w:r>
           </w:p>
         </w:tc>
@@ -6179,7 +6217,16 @@
                 <w:sz w:val="20"/>
                 <w:szCs w:val="20"/>
               </w:rPr>
-              <w:t>Name:</w:t>
+              <w:t xml:space="preserve">Name: </w:t>
+            </w:r>
+            <w:r>
+              <w:rPr>
+                <w:rFonts w:ascii="Arial" w:hAnsi="Arial"/>
+                <w:sz w:val="20"/>
+                <w:szCs w:val="20"/>
+                <w:highlight w:val="yellow"/>
+              </w:rPr>
+              <w:t>{witness_name}</w:t>
             </w:r>
           </w:p>
         </w:tc>
@@ -6253,7 +6300,16 @@
                 <w:sz w:val="20"/>
                 <w:szCs w:val="20"/>
               </w:rPr>
-              <w:t>Designation:</w:t>
+              <w:t xml:space="preserve">Designation: </w:t>
+            </w:r>
+            <w:r>
+              <w:rPr>
+                <w:rFonts w:ascii="Arial" w:hAnsi="Arial"/>
+                <w:sz w:val="20"/>
+                <w:szCs w:val="20"/>
+                <w:highlight w:val="yellow"/>
+              </w:rPr>
+              <w:t>{witness_designation}</w:t>
             </w:r>
           </w:p>
         </w:tc>

</xml_diff>

<commit_message>
Feat/documents date and stamp (#292)
* feat: add signdate fieldtype to signingcloud

* chore: adjust date field placement

* feat: add company stamp and auto sign feature

* fix: letter of offer acceptance deadline day count fixed

* feat: improve ui for signing and authorization page in admin
</commit_message>
<xml_diff>
--- a/apps/api/src/modules/applications/templates/arf-deed-of-assignment.docx
+++ b/apps/api/src/modules/applications/templates/arf-deed-of-assignment.docx
@@ -5046,12 +5046,9 @@
       <w:pPr>
         <w:jc w:val="both"/>
         <w:rPr>
-          <w:rFonts w:ascii="Arial" w:hAnsi="Arial" w:cs="Arial"/>
-          <w:b/>
-          <w:bCs/>
-          <w:sz w:val="20"/>
-          <w:szCs w:val="20"/>
-          <w:u w:val="single"/>
+          <w:rFonts w:ascii="Arial" w:hAnsi="Arial"/>
+          <w:sz w:val="20"/>
+          <w:szCs w:val="20"/>
         </w:rPr>
       </w:pPr>
     </w:p>
@@ -5060,14 +5057,14 @@
         <w:spacing w:after="0"/>
         <w:jc w:val="both"/>
         <w:rPr>
-          <w:rFonts w:ascii="Arial" w:hAnsi="Arial" w:cs="Arial"/>
-          <w:sz w:val="20"/>
-          <w:szCs w:val="20"/>
-        </w:rPr>
-      </w:pPr>
-      <w:r>
-        <w:rPr>
-          <w:rFonts w:ascii="Arial" w:hAnsi="Arial" w:cs="Arial"/>
+          <w:rFonts w:ascii="Arial" w:hAnsi="Arial"/>
+          <w:sz w:val="20"/>
+          <w:szCs w:val="20"/>
+        </w:rPr>
+      </w:pPr>
+      <w:r>
+        <w:rPr>
+          <w:rFonts w:ascii="Arial" w:hAnsi="Arial"/>
           <w:sz w:val="20"/>
           <w:szCs w:val="20"/>
         </w:rPr>
@@ -5075,7 +5072,7 @@
       </w:r>
       <w:r>
         <w:rPr>
-          <w:rFonts w:ascii="Arial" w:hAnsi="Arial" w:cs="Arial"/>
+          <w:rFonts w:ascii="Arial" w:hAnsi="Arial"/>
           <w:sz w:val="20"/>
           <w:szCs w:val="20"/>
         </w:rPr>
@@ -5083,7 +5080,7 @@
       </w:r>
       <w:r>
         <w:rPr>
-          <w:rFonts w:ascii="Arial" w:hAnsi="Arial" w:cs="Arial"/>
+          <w:rFonts w:ascii="Arial" w:hAnsi="Arial"/>
           <w:sz w:val="20"/>
           <w:szCs w:val="20"/>
         </w:rPr>
@@ -5091,7 +5088,7 @@
       </w:r>
       <w:r>
         <w:rPr>
-          <w:rFonts w:ascii="Arial" w:hAnsi="Arial" w:cs="Arial"/>
+          <w:rFonts w:ascii="Arial" w:hAnsi="Arial"/>
           <w:sz w:val="20"/>
           <w:szCs w:val="20"/>
         </w:rPr>
@@ -5099,11 +5096,18 @@
       </w:r>
       <w:r>
         <w:rPr>
-          <w:rFonts w:ascii="Arial" w:hAnsi="Arial" w:cs="Arial"/>
+          <w:rFonts w:ascii="Arial" w:hAnsi="Arial"/>
           <w:sz w:val="20"/>
           <w:szCs w:val="20"/>
         </w:rPr>
         <w:tab/>
+      </w:r>
+      <w:r>
+        <w:rPr>
+          <w:rFonts w:ascii="Arial" w:hAnsi="Arial"/>
+          <w:sz w:val="20"/>
+          <w:szCs w:val="20"/>
+        </w:rPr>
         <w:t>)</w:t>
       </w:r>
     </w:p>
@@ -5112,14 +5116,14 @@
         <w:spacing w:after="0"/>
         <w:jc w:val="both"/>
         <w:rPr>
-          <w:rFonts w:ascii="Arial" w:hAnsi="Arial" w:cs="Arial"/>
-          <w:sz w:val="20"/>
-          <w:szCs w:val="20"/>
-        </w:rPr>
-      </w:pPr>
-      <w:r>
-        <w:rPr>
-          <w:rFonts w:ascii="Arial" w:hAnsi="Arial" w:cs="Arial"/>
+          <w:rFonts w:ascii="Arial" w:hAnsi="Arial"/>
+          <w:sz w:val="20"/>
+          <w:szCs w:val="20"/>
+        </w:rPr>
+      </w:pPr>
+      <w:r>
+        <w:rPr>
+          <w:rFonts w:ascii="Arial" w:hAnsi="Arial"/>
           <w:sz w:val="20"/>
           <w:szCs w:val="20"/>
         </w:rPr>
@@ -5127,7 +5131,7 @@
       </w:r>
       <w:r>
         <w:rPr>
-          <w:rFonts w:ascii="Arial" w:hAnsi="Arial" w:cs="Arial"/>
+          <w:rFonts w:ascii="Arial" w:hAnsi="Arial"/>
           <w:sz w:val="20"/>
           <w:szCs w:val="20"/>
         </w:rPr>
@@ -5135,7 +5139,7 @@
       </w:r>
       <w:r>
         <w:rPr>
-          <w:rFonts w:ascii="Arial" w:hAnsi="Arial" w:cs="Arial"/>
+          <w:rFonts w:ascii="Arial" w:hAnsi="Arial"/>
           <w:sz w:val="20"/>
           <w:szCs w:val="20"/>
         </w:rPr>
@@ -5143,11 +5147,18 @@
       </w:r>
       <w:r>
         <w:rPr>
-          <w:rFonts w:ascii="Arial" w:hAnsi="Arial" w:cs="Arial"/>
+          <w:rFonts w:ascii="Arial" w:hAnsi="Arial"/>
           <w:sz w:val="20"/>
           <w:szCs w:val="20"/>
         </w:rPr>
         <w:tab/>
+      </w:r>
+      <w:r>
+        <w:rPr>
+          <w:rFonts w:ascii="Arial" w:hAnsi="Arial"/>
+          <w:sz w:val="20"/>
+          <w:szCs w:val="20"/>
+        </w:rPr>
         <w:t>)</w:t>
       </w:r>
     </w:p>
@@ -5156,16 +5167,14 @@
         <w:spacing w:after="0"/>
         <w:jc w:val="both"/>
         <w:rPr>
-          <w:rFonts w:ascii="Arial" w:hAnsi="Arial" w:cs="Arial"/>
-          <w:sz w:val="20"/>
-          <w:szCs w:val="20"/>
-        </w:rPr>
-      </w:pPr>
-      <w:r>
-        <w:rPr>
-          <w:rFonts w:ascii="Arial" w:hAnsi="Arial" w:cs="Arial"/>
-          <w:b/>
-          <w:bCs/>
+          <w:rFonts w:ascii="Arial" w:hAnsi="Arial"/>
+          <w:sz w:val="20"/>
+          <w:szCs w:val="20"/>
+        </w:rPr>
+      </w:pPr>
+      <w:r>
+        <w:rPr>
+          <w:rFonts w:ascii="Arial" w:hAnsi="Arial"/>
           <w:sz w:val="20"/>
           <w:szCs w:val="20"/>
         </w:rPr>
@@ -5173,20 +5182,23 @@
       </w:r>
       <w:r>
         <w:rPr>
-          <w:rFonts w:ascii="Arial" w:hAnsi="Arial" w:cs="Arial"/>
-          <w:b/>
-          <w:bCs/>
+          <w:rFonts w:ascii="Arial" w:hAnsi="Arial"/>
           <w:sz w:val="20"/>
           <w:szCs w:val="20"/>
         </w:rPr>
         <w:tab/>
+      </w:r>
+      <w:r>
+        <w:rPr>
+          <w:rFonts w:ascii="Arial" w:hAnsi="Arial"/>
+          <w:sz w:val="20"/>
+          <w:szCs w:val="20"/>
+        </w:rPr>
         <w:t>)</w:t>
       </w:r>
       <w:r>
         <w:rPr>
-          <w:rFonts w:ascii="Arial" w:hAnsi="Arial" w:cs="Arial"/>
-          <w:b/>
-          <w:bCs/>
+          <w:rFonts w:ascii="Arial" w:hAnsi="Arial"/>
           <w:sz w:val="20"/>
           <w:szCs w:val="20"/>
         </w:rPr>
@@ -5194,7 +5206,7 @@
       </w:r>
       <w:r>
         <w:rPr>
-          <w:rFonts w:ascii="Arial" w:hAnsi="Arial" w:cs="Arial"/>
+          <w:rFonts w:ascii="Arial" w:hAnsi="Arial"/>
           <w:sz w:val="20"/>
           <w:szCs w:val="20"/>
         </w:rPr>
@@ -5206,14 +5218,14 @@
         <w:spacing w:after="0"/>
         <w:jc w:val="both"/>
         <w:rPr>
-          <w:rFonts w:ascii="Arial" w:hAnsi="Arial" w:cs="Arial"/>
-          <w:sz w:val="20"/>
-          <w:szCs w:val="20"/>
-        </w:rPr>
-      </w:pPr>
-      <w:r>
-        <w:rPr>
-          <w:rFonts w:ascii="Arial" w:hAnsi="Arial" w:cs="Arial"/>
+          <w:rFonts w:ascii="Arial" w:hAnsi="Arial"/>
+          <w:sz w:val="20"/>
+          <w:szCs w:val="20"/>
+        </w:rPr>
+      </w:pPr>
+      <w:r>
+        <w:rPr>
+          <w:rFonts w:ascii="Arial" w:hAnsi="Arial"/>
           <w:sz w:val="20"/>
           <w:szCs w:val="20"/>
         </w:rPr>
@@ -5221,7 +5233,7 @@
       </w:r>
       <w:r>
         <w:rPr>
-          <w:rFonts w:ascii="Arial" w:hAnsi="Arial" w:cs="Arial"/>
+          <w:rFonts w:ascii="Arial" w:hAnsi="Arial"/>
           <w:sz w:val="20"/>
           <w:szCs w:val="20"/>
         </w:rPr>
@@ -5229,7 +5241,7 @@
       </w:r>
       <w:r>
         <w:rPr>
-          <w:rFonts w:ascii="Arial" w:hAnsi="Arial" w:cs="Arial"/>
+          <w:rFonts w:ascii="Arial" w:hAnsi="Arial"/>
           <w:sz w:val="20"/>
           <w:szCs w:val="20"/>
         </w:rPr>
@@ -5237,7 +5249,7 @@
       </w:r>
       <w:r>
         <w:rPr>
-          <w:rFonts w:ascii="Arial" w:hAnsi="Arial" w:cs="Arial"/>
+          <w:rFonts w:ascii="Arial" w:hAnsi="Arial"/>
           <w:sz w:val="20"/>
           <w:szCs w:val="20"/>
         </w:rPr>
@@ -5245,7 +5257,7 @@
       </w:r>
       <w:r>
         <w:rPr>
-          <w:rFonts w:ascii="Arial" w:hAnsi="Arial" w:cs="Arial"/>
+          <w:rFonts w:ascii="Arial" w:hAnsi="Arial"/>
           <w:sz w:val="20"/>
           <w:szCs w:val="20"/>
         </w:rPr>
@@ -5253,12 +5265,28 @@
       </w:r>
       <w:r>
         <w:rPr>
-          <w:rFonts w:ascii="Arial" w:hAnsi="Arial" w:cs="Arial"/>
+          <w:rFonts w:ascii="Arial" w:hAnsi="Arial"/>
           <w:sz w:val="20"/>
           <w:szCs w:val="20"/>
         </w:rPr>
         <w:tab/>
-        <w:t>Name:</w:t>
+      </w:r>
+      <w:r>
+        <w:rPr>
+          <w:rFonts w:ascii="Arial" w:hAnsi="Arial"/>
+          <w:sz w:val="20"/>
+          <w:szCs w:val="20"/>
+        </w:rPr>
+        <w:t xml:space="preserve">Name: </w:t>
+      </w:r>
+      <w:r>
+        <w:rPr>
+          <w:rFonts w:ascii="Arial" w:hAnsi="Arial"/>
+          <w:sz w:val="20"/>
+          <w:szCs w:val="20"/>
+          <w:highlight w:val="yellow"/>
+        </w:rPr>
+        <w:t>{ssp_1_name}</w:t>
       </w:r>
     </w:p>
     <w:p>
@@ -5266,14 +5294,14 @@
         <w:spacing w:after="0"/>
         <w:jc w:val="both"/>
         <w:rPr>
-          <w:rFonts w:ascii="Arial" w:hAnsi="Arial" w:cs="Arial"/>
-          <w:sz w:val="20"/>
-          <w:szCs w:val="20"/>
-        </w:rPr>
-      </w:pPr>
-      <w:r>
-        <w:rPr>
-          <w:rFonts w:ascii="Arial" w:hAnsi="Arial" w:cs="Arial"/>
+          <w:rFonts w:ascii="Arial" w:hAnsi="Arial"/>
+          <w:sz w:val="20"/>
+          <w:szCs w:val="20"/>
+        </w:rPr>
+      </w:pPr>
+      <w:r>
+        <w:rPr>
+          <w:rFonts w:ascii="Arial" w:hAnsi="Arial"/>
           <w:sz w:val="20"/>
           <w:szCs w:val="20"/>
         </w:rPr>
@@ -5281,7 +5309,7 @@
       </w:r>
       <w:r>
         <w:rPr>
-          <w:rFonts w:ascii="Arial" w:hAnsi="Arial" w:cs="Arial"/>
+          <w:rFonts w:ascii="Arial" w:hAnsi="Arial"/>
           <w:sz w:val="20"/>
           <w:szCs w:val="20"/>
         </w:rPr>
@@ -5289,7 +5317,7 @@
       </w:r>
       <w:r>
         <w:rPr>
-          <w:rFonts w:ascii="Arial" w:hAnsi="Arial" w:cs="Arial"/>
+          <w:rFonts w:ascii="Arial" w:hAnsi="Arial"/>
           <w:sz w:val="20"/>
           <w:szCs w:val="20"/>
         </w:rPr>
@@ -5297,7 +5325,7 @@
       </w:r>
       <w:r>
         <w:rPr>
-          <w:rFonts w:ascii="Arial" w:hAnsi="Arial" w:cs="Arial"/>
+          <w:rFonts w:ascii="Arial" w:hAnsi="Arial"/>
           <w:sz w:val="20"/>
           <w:szCs w:val="20"/>
         </w:rPr>
@@ -5305,7 +5333,7 @@
       </w:r>
       <w:r>
         <w:rPr>
-          <w:rFonts w:ascii="Arial" w:hAnsi="Arial" w:cs="Arial"/>
+          <w:rFonts w:ascii="Arial" w:hAnsi="Arial"/>
           <w:sz w:val="20"/>
           <w:szCs w:val="20"/>
         </w:rPr>
@@ -5313,59 +5341,75 @@
       </w:r>
       <w:r>
         <w:rPr>
-          <w:rFonts w:ascii="Arial" w:hAnsi="Arial" w:cs="Arial"/>
+          <w:rFonts w:ascii="Arial" w:hAnsi="Arial"/>
           <w:sz w:val="20"/>
           <w:szCs w:val="20"/>
         </w:rPr>
         <w:tab/>
-        <w:t>Designation:</w:t>
-      </w:r>
-    </w:p>
-    <w:p>
-      <w:pPr>
-        <w:jc w:val="both"/>
-        <w:rPr>
-          <w:rFonts w:ascii="Arial" w:hAnsi="Arial" w:cs="Arial"/>
-          <w:sz w:val="20"/>
-          <w:szCs w:val="20"/>
-        </w:rPr>
-      </w:pPr>
-    </w:p>
-    <w:p>
-      <w:pPr>
-        <w:jc w:val="both"/>
-        <w:rPr>
-          <w:rFonts w:ascii="Arial" w:hAnsi="Arial" w:cs="Arial"/>
-          <w:sz w:val="20"/>
-          <w:szCs w:val="20"/>
-        </w:rPr>
-      </w:pPr>
-    </w:p>
-    <w:p>
-      <w:pPr>
-        <w:jc w:val="both"/>
-        <w:rPr>
-          <w:rFonts w:ascii="Arial" w:hAnsi="Arial" w:cs="Arial"/>
-          <w:sz w:val="20"/>
-          <w:szCs w:val="20"/>
-        </w:rPr>
-      </w:pPr>
-    </w:p>
-    <w:p>
-      <w:pPr>
-        <w:jc w:val="both"/>
-        <w:rPr>
-          <w:rFonts w:ascii="Arial" w:hAnsi="Arial" w:cs="Arial"/>
-          <w:sz w:val="20"/>
-          <w:szCs w:val="20"/>
-        </w:rPr>
-      </w:pPr>
-    </w:p>
-    <w:p>
-      <w:pPr>
-        <w:jc w:val="both"/>
-        <w:rPr>
-          <w:rFonts w:ascii="Arial" w:hAnsi="Arial" w:cs="Arial"/>
+      </w:r>
+      <w:r>
+        <w:rPr>
+          <w:rFonts w:ascii="Arial" w:hAnsi="Arial"/>
+          <w:sz w:val="20"/>
+          <w:szCs w:val="20"/>
+        </w:rPr>
+        <w:t xml:space="preserve">Designation: </w:t>
+      </w:r>
+      <w:r>
+        <w:rPr>
+          <w:rFonts w:ascii="Arial" w:hAnsi="Arial"/>
+          <w:sz w:val="20"/>
+          <w:szCs w:val="20"/>
+          <w:highlight w:val="yellow"/>
+        </w:rPr>
+        <w:t>{ssp_1_designation}</w:t>
+      </w:r>
+    </w:p>
+    <w:p>
+      <w:pPr>
+        <w:jc w:val="both"/>
+        <w:rPr>
+          <w:rFonts w:ascii="Arial" w:hAnsi="Arial"/>
+          <w:sz w:val="20"/>
+          <w:szCs w:val="20"/>
+        </w:rPr>
+      </w:pPr>
+    </w:p>
+    <w:p>
+      <w:pPr>
+        <w:jc w:val="both"/>
+        <w:rPr>
+          <w:rFonts w:ascii="Arial" w:hAnsi="Arial"/>
+          <w:sz w:val="20"/>
+          <w:szCs w:val="20"/>
+        </w:rPr>
+      </w:pPr>
+    </w:p>
+    <w:p>
+      <w:pPr>
+        <w:jc w:val="both"/>
+        <w:rPr>
+          <w:rFonts w:ascii="Arial" w:hAnsi="Arial"/>
+          <w:sz w:val="20"/>
+          <w:szCs w:val="20"/>
+        </w:rPr>
+      </w:pPr>
+    </w:p>
+    <w:p>
+      <w:pPr>
+        <w:jc w:val="both"/>
+        <w:rPr>
+          <w:rFonts w:ascii="Arial" w:hAnsi="Arial"/>
+          <w:sz w:val="20"/>
+          <w:szCs w:val="20"/>
+        </w:rPr>
+      </w:pPr>
+    </w:p>
+    <w:p>
+      <w:pPr>
+        <w:jc w:val="both"/>
+        <w:rPr>
+          <w:rFonts w:ascii="Arial" w:hAnsi="Arial"/>
           <w:sz w:val="20"/>
           <w:szCs w:val="20"/>
         </w:rPr>
@@ -5376,14 +5420,14 @@
         <w:spacing w:after="0"/>
         <w:jc w:val="both"/>
         <w:rPr>
-          <w:rFonts w:ascii="Arial" w:hAnsi="Arial" w:cs="Arial"/>
-          <w:sz w:val="20"/>
-          <w:szCs w:val="20"/>
-        </w:rPr>
-      </w:pPr>
-      <w:r>
-        <w:rPr>
-          <w:rFonts w:ascii="Arial" w:hAnsi="Arial" w:cs="Arial"/>
+          <w:rFonts w:ascii="Arial" w:hAnsi="Arial"/>
+          <w:sz w:val="20"/>
+          <w:szCs w:val="20"/>
+        </w:rPr>
+      </w:pPr>
+      <w:r>
+        <w:rPr>
+          <w:rFonts w:ascii="Arial" w:hAnsi="Arial"/>
           <w:sz w:val="20"/>
           <w:szCs w:val="20"/>
         </w:rPr>
@@ -5391,7 +5435,7 @@
       </w:r>
       <w:r>
         <w:rPr>
-          <w:rFonts w:ascii="Arial" w:hAnsi="Arial" w:cs="Arial"/>
+          <w:rFonts w:ascii="Arial" w:hAnsi="Arial"/>
           <w:sz w:val="20"/>
           <w:szCs w:val="20"/>
         </w:rPr>
@@ -5399,7 +5443,7 @@
       </w:r>
       <w:r>
         <w:rPr>
-          <w:rFonts w:ascii="Arial" w:hAnsi="Arial" w:cs="Arial"/>
+          <w:rFonts w:ascii="Arial" w:hAnsi="Arial"/>
           <w:sz w:val="20"/>
           <w:szCs w:val="20"/>
         </w:rPr>
@@ -5407,7 +5451,7 @@
       </w:r>
       <w:r>
         <w:rPr>
-          <w:rFonts w:ascii="Arial" w:hAnsi="Arial" w:cs="Arial"/>
+          <w:rFonts w:ascii="Arial" w:hAnsi="Arial"/>
           <w:sz w:val="20"/>
           <w:szCs w:val="20"/>
         </w:rPr>
@@ -5415,7 +5459,7 @@
       </w:r>
       <w:r>
         <w:rPr>
-          <w:rFonts w:ascii="Arial" w:hAnsi="Arial" w:cs="Arial"/>
+          <w:rFonts w:ascii="Arial" w:hAnsi="Arial"/>
           <w:sz w:val="20"/>
           <w:szCs w:val="20"/>
         </w:rPr>
@@ -5423,7 +5467,7 @@
       </w:r>
       <w:r>
         <w:rPr>
-          <w:rFonts w:ascii="Arial" w:hAnsi="Arial" w:cs="Arial"/>
+          <w:rFonts w:ascii="Arial" w:hAnsi="Arial"/>
           <w:sz w:val="20"/>
           <w:szCs w:val="20"/>
         </w:rPr>
@@ -5431,7 +5475,7 @@
       </w:r>
       <w:r>
         <w:rPr>
-          <w:rFonts w:ascii="Arial" w:hAnsi="Arial" w:cs="Arial"/>
+          <w:rFonts w:ascii="Arial" w:hAnsi="Arial"/>
           <w:sz w:val="20"/>
           <w:szCs w:val="20"/>
         </w:rPr>
@@ -5443,14 +5487,14 @@
         <w:spacing w:after="0"/>
         <w:jc w:val="both"/>
         <w:rPr>
-          <w:rFonts w:ascii="Arial" w:hAnsi="Arial" w:cs="Arial"/>
-          <w:sz w:val="20"/>
-          <w:szCs w:val="20"/>
-        </w:rPr>
-      </w:pPr>
-      <w:r>
-        <w:rPr>
-          <w:rFonts w:ascii="Arial" w:hAnsi="Arial" w:cs="Arial"/>
+          <w:rFonts w:ascii="Arial" w:hAnsi="Arial"/>
+          <w:sz w:val="20"/>
+          <w:szCs w:val="20"/>
+        </w:rPr>
+      </w:pPr>
+      <w:r>
+        <w:rPr>
+          <w:rFonts w:ascii="Arial" w:hAnsi="Arial"/>
           <w:sz w:val="20"/>
           <w:szCs w:val="20"/>
         </w:rPr>
@@ -5458,7 +5502,7 @@
       </w:r>
       <w:r>
         <w:rPr>
-          <w:rFonts w:ascii="Arial" w:hAnsi="Arial" w:cs="Arial"/>
+          <w:rFonts w:ascii="Arial" w:hAnsi="Arial"/>
           <w:sz w:val="20"/>
           <w:szCs w:val="20"/>
         </w:rPr>
@@ -5466,7 +5510,7 @@
       </w:r>
       <w:r>
         <w:rPr>
-          <w:rFonts w:ascii="Arial" w:hAnsi="Arial" w:cs="Arial"/>
+          <w:rFonts w:ascii="Arial" w:hAnsi="Arial"/>
           <w:sz w:val="20"/>
           <w:szCs w:val="20"/>
         </w:rPr>
@@ -5474,7 +5518,7 @@
       </w:r>
       <w:r>
         <w:rPr>
-          <w:rFonts w:ascii="Arial" w:hAnsi="Arial" w:cs="Arial"/>
+          <w:rFonts w:ascii="Arial" w:hAnsi="Arial"/>
           <w:sz w:val="20"/>
           <w:szCs w:val="20"/>
         </w:rPr>
@@ -5482,7 +5526,7 @@
       </w:r>
       <w:r>
         <w:rPr>
-          <w:rFonts w:ascii="Arial" w:hAnsi="Arial" w:cs="Arial"/>
+          <w:rFonts w:ascii="Arial" w:hAnsi="Arial"/>
           <w:sz w:val="20"/>
           <w:szCs w:val="20"/>
         </w:rPr>
@@ -5490,12 +5534,28 @@
       </w:r>
       <w:r>
         <w:rPr>
-          <w:rFonts w:ascii="Arial" w:hAnsi="Arial" w:cs="Arial"/>
+          <w:rFonts w:ascii="Arial" w:hAnsi="Arial"/>
           <w:sz w:val="20"/>
           <w:szCs w:val="20"/>
         </w:rPr>
         <w:tab/>
-        <w:t>Name:</w:t>
+      </w:r>
+      <w:r>
+        <w:rPr>
+          <w:rFonts w:ascii="Arial" w:hAnsi="Arial"/>
+          <w:sz w:val="20"/>
+          <w:szCs w:val="20"/>
+        </w:rPr>
+        <w:t xml:space="preserve">Name: </w:t>
+      </w:r>
+      <w:r>
+        <w:rPr>
+          <w:rFonts w:ascii="Arial" w:hAnsi="Arial"/>
+          <w:sz w:val="20"/>
+          <w:szCs w:val="20"/>
+          <w:highlight w:val="yellow"/>
+        </w:rPr>
+        <w:t>{ssp_2_name}</w:t>
       </w:r>
     </w:p>
     <w:p>
@@ -5503,14 +5563,14 @@
         <w:spacing w:after="0"/>
         <w:jc w:val="both"/>
         <w:rPr>
-          <w:rFonts w:ascii="Arial" w:hAnsi="Arial" w:cs="Arial"/>
-          <w:sz w:val="20"/>
-          <w:szCs w:val="20"/>
-        </w:rPr>
-      </w:pPr>
-      <w:r>
-        <w:rPr>
-          <w:rFonts w:ascii="Arial" w:hAnsi="Arial" w:cs="Arial"/>
+          <w:rFonts w:ascii="Arial" w:hAnsi="Arial"/>
+          <w:sz w:val="20"/>
+          <w:szCs w:val="20"/>
+        </w:rPr>
+      </w:pPr>
+      <w:r>
+        <w:rPr>
+          <w:rFonts w:ascii="Arial" w:hAnsi="Arial"/>
           <w:sz w:val="20"/>
           <w:szCs w:val="20"/>
         </w:rPr>
@@ -5518,7 +5578,7 @@
       </w:r>
       <w:r>
         <w:rPr>
-          <w:rFonts w:ascii="Arial" w:hAnsi="Arial" w:cs="Arial"/>
+          <w:rFonts w:ascii="Arial" w:hAnsi="Arial"/>
           <w:sz w:val="20"/>
           <w:szCs w:val="20"/>
         </w:rPr>
@@ -5526,7 +5586,7 @@
       </w:r>
       <w:r>
         <w:rPr>
-          <w:rFonts w:ascii="Arial" w:hAnsi="Arial" w:cs="Arial"/>
+          <w:rFonts w:ascii="Arial" w:hAnsi="Arial"/>
           <w:sz w:val="20"/>
           <w:szCs w:val="20"/>
         </w:rPr>
@@ -5534,7 +5594,7 @@
       </w:r>
       <w:r>
         <w:rPr>
-          <w:rFonts w:ascii="Arial" w:hAnsi="Arial" w:cs="Arial"/>
+          <w:rFonts w:ascii="Arial" w:hAnsi="Arial"/>
           <w:sz w:val="20"/>
           <w:szCs w:val="20"/>
         </w:rPr>
@@ -5542,7 +5602,7 @@
       </w:r>
       <w:r>
         <w:rPr>
-          <w:rFonts w:ascii="Arial" w:hAnsi="Arial" w:cs="Arial"/>
+          <w:rFonts w:ascii="Arial" w:hAnsi="Arial"/>
           <w:sz w:val="20"/>
           <w:szCs w:val="20"/>
         </w:rPr>
@@ -5550,105 +5610,83 @@
       </w:r>
       <w:r>
         <w:rPr>
-          <w:rFonts w:ascii="Arial" w:hAnsi="Arial" w:cs="Arial"/>
+          <w:rFonts w:ascii="Arial" w:hAnsi="Arial"/>
           <w:sz w:val="20"/>
           <w:szCs w:val="20"/>
         </w:rPr>
         <w:tab/>
-        <w:t>Designation:</w:t>
-      </w:r>
-    </w:p>
-    <w:p>
-      <w:pPr>
-        <w:jc w:val="both"/>
-        <w:rPr>
-          <w:rFonts w:ascii="Arial" w:hAnsi="Arial" w:cs="Arial"/>
-          <w:sz w:val="20"/>
-          <w:szCs w:val="20"/>
-        </w:rPr>
-      </w:pPr>
-    </w:p>
-    <w:tbl>
-      <w:tblPr>
-        <w:tblStyle w:val="TableGrid"/>
-        <w:tblW w:w="0" w:type="auto"/>
-        <w:tblInd w:w="4135" w:type="dxa"/>
-        <w:tblLook w:val="04A0" w:firstRow="1" w:lastRow="0" w:firstColumn="1" w:lastColumn="0" w:noHBand="0" w:noVBand="1"/>
-      </w:tblPr>
-      <w:tblGrid>
-        <w:gridCol w:w="5215"/>
-      </w:tblGrid>
-      <w:tr>
-        <w:trPr>
-          <w:trHeight w:val="1592"/>
-        </w:trPr>
-        <w:tc>
-          <w:tcPr>
-            <w:tcW w:w="5215" w:type="dxa"/>
-          </w:tcPr>
-          <w:p>
-            <w:pPr>
-              <w:jc w:val="both"/>
-              <w:rPr>
-                <w:rFonts w:ascii="Arial" w:hAnsi="Arial" w:cs="Arial"/>
-                <w:sz w:val="20"/>
-                <w:szCs w:val="20"/>
-              </w:rPr>
-            </w:pPr>
-            <w:r>
-              <w:rPr>
-                <w:rFonts w:ascii="Arial" w:hAnsi="Arial" w:cs="Arial"/>
-                <w:sz w:val="20"/>
-                <w:szCs w:val="20"/>
-              </w:rPr>
-              <w:t xml:space="preserve">[SSP] </w:t>
-            </w:r>
-          </w:p>
-          <w:p>
-            <w:pPr>
-              <w:jc w:val="both"/>
-              <w:rPr>
-                <w:rFonts w:ascii="Arial" w:hAnsi="Arial" w:cs="Arial"/>
-                <w:sz w:val="20"/>
-                <w:szCs w:val="20"/>
-              </w:rPr>
-            </w:pPr>
-            <w:r>
-              <w:rPr>
-                <w:rFonts w:ascii="Arial" w:hAnsi="Arial" w:cs="Arial"/>
-                <w:sz w:val="20"/>
-                <w:szCs w:val="20"/>
-              </w:rPr>
-              <w:t>Company Stamp:</w:t>
-            </w:r>
-          </w:p>
-        </w:tc>
-      </w:tr>
-    </w:tbl>
-    <w:p>
-      <w:pPr>
-        <w:jc w:val="both"/>
-        <w:rPr>
-          <w:rFonts w:ascii="Arial" w:hAnsi="Arial" w:cs="Arial"/>
-          <w:sz w:val="20"/>
-          <w:szCs w:val="20"/>
-        </w:rPr>
-      </w:pPr>
-    </w:p>
-    <w:p>
-      <w:pPr>
-        <w:rPr>
-          <w:rFonts w:ascii="Arial" w:hAnsi="Arial" w:cs="Arial"/>
-          <w:sz w:val="20"/>
-          <w:szCs w:val="20"/>
-        </w:rPr>
-      </w:pPr>
-      <w:r>
-        <w:rPr>
-          <w:rFonts w:ascii="Arial" w:hAnsi="Arial" w:cs="Arial"/>
-          <w:sz w:val="20"/>
-          <w:szCs w:val="20"/>
-        </w:rPr>
+      </w:r>
+      <w:r>
+        <w:rPr>
+          <w:rFonts w:ascii="Arial" w:hAnsi="Arial"/>
+          <w:sz w:val="20"/>
+          <w:szCs w:val="20"/>
+        </w:rPr>
+        <w:t xml:space="preserve">Designation: </w:t>
+      </w:r>
+      <w:r>
+        <w:rPr>
+          <w:rFonts w:ascii="Arial" w:hAnsi="Arial"/>
+          <w:sz w:val="20"/>
+          <w:szCs w:val="20"/>
+          <w:highlight w:val="yellow"/>
+        </w:rPr>
+        <w:t>{ssp_2_designation}</w:t>
+      </w:r>
+    </w:p>
+    <w:p>
+      <w:pPr>
+        <w:jc w:val="both"/>
+        <w:rPr>
+          <w:rFonts w:ascii="Arial" w:hAnsi="Arial"/>
+          <w:sz w:val="20"/>
+          <w:szCs w:val="20"/>
+        </w:rPr>
+      </w:pPr>
+    </w:p>
+    <w:p>
+      <w:pPr>
+        <w:spacing w:line="360" w:lineRule="auto"/>
+        <w:jc w:val="both"/>
+        <w:rPr>
+          <w:rFonts w:ascii="Arial" w:hAnsi="Arial"/>
+          <w:sz w:val="20"/>
+          <w:szCs w:val="20"/>
+        </w:rPr>
+      </w:pPr>
+      <w:r>
+        <w:rPr>
+          <w:rFonts w:ascii="Arial" w:hAnsi="Arial"/>
+          <w:sz w:val="20"/>
+          <w:szCs w:val="20"/>
+        </w:rPr>
+        <w:t>[SSP]</w:t>
+      </w:r>
+    </w:p>
+    <w:p>
+      <w:pPr>
+        <w:spacing w:line="360" w:lineRule="auto"/>
+        <w:jc w:val="both"/>
+        <w:rPr>
+          <w:rFonts w:ascii="Arial" w:hAnsi="Arial"/>
+          <w:sz w:val="20"/>
+          <w:szCs w:val="20"/>
+        </w:rPr>
+      </w:pPr>
+      <w:r>
+        <w:rPr>
+          <w:rFonts w:ascii="Arial" w:hAnsi="Arial"/>
+          <w:sz w:val="20"/>
+          <w:szCs w:val="20"/>
+        </w:rPr>
+        <w:t>Company Stamp: §SSP_COMPANY_STAMP_IMAGE§</w:t>
+      </w:r>
+    </w:p>
+    <w:p>
+      <w:pPr>
+        <w:spacing w:line="360" w:lineRule="auto"/>
+      </w:pPr>
+      <w:r>
         <w:br w:type="page"/>
       </w:r>
     </w:p>
@@ -6018,7 +6056,7 @@
                 <w:sz w:val="20"/>
                 <w:szCs w:val="20"/>
               </w:rPr>
-              <w:t>...........................................................................</w:t>
+              <w:t>______________________________________</w:t>
             </w:r>
           </w:p>
         </w:tc>
@@ -6048,7 +6086,7 @@
                 <w:sz w:val="20"/>
                 <w:szCs w:val="20"/>
               </w:rPr>
-              <w:t>..............................................................</w:t>
+              <w:t>_______________________________</w:t>
             </w:r>
           </w:p>
         </w:tc>
@@ -6179,7 +6217,16 @@
                 <w:sz w:val="20"/>
                 <w:szCs w:val="20"/>
               </w:rPr>
-              <w:t>Name:</w:t>
+              <w:t xml:space="preserve">Name: </w:t>
+            </w:r>
+            <w:r>
+              <w:rPr>
+                <w:rFonts w:ascii="Arial" w:hAnsi="Arial"/>
+                <w:sz w:val="20"/>
+                <w:szCs w:val="20"/>
+                <w:highlight w:val="yellow"/>
+              </w:rPr>
+              <w:t>{witness_name}</w:t>
             </w:r>
           </w:p>
         </w:tc>
@@ -6253,7 +6300,16 @@
                 <w:sz w:val="20"/>
                 <w:szCs w:val="20"/>
               </w:rPr>
-              <w:t>Designation:</w:t>
+              <w:t xml:space="preserve">Designation: </w:t>
+            </w:r>
+            <w:r>
+              <w:rPr>
+                <w:rFonts w:ascii="Arial" w:hAnsi="Arial"/>
+                <w:sz w:val="20"/>
+                <w:szCs w:val="20"/>
+                <w:highlight w:val="yellow"/>
+              </w:rPr>
+              <w:t>{witness_designation}</w:t>
             </w:r>
           </w:p>
         </w:tc>

</xml_diff>